<commit_message>
feat: add extensive project documentation and research analysis reports in both English and Vietnamese with supporting analysis scripts
</commit_message>
<xml_diff>
--- a/docs/en/1_Project_Overview.docx
+++ b/docs/en/1_Project_Overview.docx
@@ -477,6 +477,68 @@
         <w:t>: Mouse hover counts, hover durations per feature, and chatbot conversation records.</w:t>
       </w:r>
     </w:p>
+    <w:p>
+      <w:pPr>
+        <w:jc w:val="center"/>
+      </w:pPr>
+      <w:r>
+        <w:rPr>
+          <w:color w:val="B4B4B4"/>
+        </w:rPr>
+        <w:t>__________________________________________________</w:t>
+      </w:r>
+    </w:p>
+    <w:p>
+      <w:pPr>
+        <w:pStyle w:val="Heading3"/>
+      </w:pPr>
+      <w:r>
+        <w:t>AI Collaboration &amp; Attribution Statement</w:t>
+      </w:r>
+    </w:p>
+    <w:p>
+      <w:pPr>
+        <w:pStyle w:val="ListBullet"/>
+      </w:pPr>
+      <w:r>
+        <w:t xml:space="preserve">  </w:t>
+      </w:r>
+      <w:r>
+        <w:rPr>
+          <w:b/>
+        </w:rPr>
+        <w:t>Technical Support &amp; Drafting</w:t>
+      </w:r>
+      <w:r>
+        <w:t xml:space="preserve">: This document was compiled, structured, and translated with the assistance of </w:t>
+      </w:r>
+      <w:r>
+        <w:rPr>
+          <w:b/>
+        </w:rPr>
+        <w:t>Antigravity (Advanced Agentic Coding Assistant from Google DeepMind)</w:t>
+      </w:r>
+      <w:r>
+        <w:t>.</w:t>
+      </w:r>
+    </w:p>
+    <w:p>
+      <w:pPr>
+        <w:pStyle w:val="ListBullet"/>
+      </w:pPr>
+      <w:r>
+        <w:t xml:space="preserve">  </w:t>
+      </w:r>
+      <w:r>
+        <w:rPr>
+          <w:b/>
+        </w:rPr>
+        <w:t>Scientific Design &amp; Responsibility</w:t>
+      </w:r>
+      <w:r>
+        <w:t>: The core research objectives, experimental hypotheses, empirical data collection, and qualitative UI insights (such as task workflow ambiguity observations) are the sole intellectual product and scientific responsibility of the human researcher (thesis author).</w:t>
+      </w:r>
+    </w:p>
     <w:sectPr>
       <w:pgSz w:w="12240" w:h="15840"/>
       <w:pgMar w:top="1440" w:right="1440" w:bottom="1440" w:left="1440" w:header="720" w:footer="720" w:gutter="0"/>

</xml_diff>